<commit_message>
feat(report): incorporate Title-by-Title Legal Development (Section 1.4) into Master Dossier and recompile package
</commit_message>
<xml_diff>
--- a/Draft_Versions/2026-10-10/PFPJ_Minab_Factual_Determination_Main_Report_2026-10-10_Draft.docx
+++ b/Draft_Versions/2026-10-10/PFPJ_Minab_Factual_Determination_Main_Report_2026-10-10_Draft.docx
@@ -295,7 +295,7 @@
           <w:color w:val="334155"/>
           <w:sz w:val="19"/>
         </w:rPr>
-        <w:t>Principal Comparative Jurisprudential Benchmark:</w:t>
+        <w:t>Principal Comparative Jurisprudential Benchmarks:</w:t>
       </w:r>
       <w:r>
         <w:rPr>
@@ -313,7 +313,7 @@
           <w:color w:val="334155"/>
           <w:sz w:val="19"/>
         </w:rPr>
-        <w:t>The Bombing of the Chinese Embassy in Belgrade</w:t>
+        <w:t>Belgrade Chinese Embassy Precedent</w:t>
       </w:r>
       <w:r>
         <w:rPr>
@@ -322,7 +322,43 @@
           <w:color w:val="334155"/>
           <w:sz w:val="19"/>
         </w:rPr>
-        <w:t xml:space="preserve">, Final Report to the Prosecutor, Paragraphs 80–85) </w:t>
+        <w:t>, ¶¶ 80–85); European Court of Human Rights Canonical Aerial Bombardment Landmarks (</w:t>
+      </w:r>
+      <w:r>
+        <w:rPr>
+          <w:rFonts w:ascii="Calibri" w:hAnsi="Calibri"/>
+          <w:i/>
+          <w:color w:val="334155"/>
+          <w:sz w:val="19"/>
+        </w:rPr>
+        <w:t>Isayeva v. Russia</w:t>
+      </w:r>
+      <w:r>
+        <w:rPr>
+          <w:rFonts w:ascii="Calibri" w:hAnsi="Calibri"/>
+          <w:i/>
+          <w:color w:val="334155"/>
+          <w:sz w:val="19"/>
+        </w:rPr>
+        <w:t xml:space="preserve">, App. 57950/00; </w:t>
+      </w:r>
+      <w:r>
+        <w:rPr>
+          <w:rFonts w:ascii="Calibri" w:hAnsi="Calibri"/>
+          <w:i/>
+          <w:color w:val="334155"/>
+          <w:sz w:val="19"/>
+        </w:rPr>
+        <w:t>Isayeva, Yusupova and Bazayeva v. Russia</w:t>
+      </w:r>
+      <w:r>
+        <w:rPr>
+          <w:rFonts w:ascii="Calibri" w:hAnsi="Calibri"/>
+          <w:i/>
+          <w:color w:val="334155"/>
+          <w:sz w:val="19"/>
+        </w:rPr>
+        <w:t xml:space="preserve">, App. 57947/00) </w:t>
       </w:r>
       <w:r>
         <w:rPr>
@@ -625,6 +661,22 @@
       <w:pPr>
         <w:pStyle w:val="ListBullet"/>
         <w:spacing w:before="20" w:after="40"/>
+        <w:ind w:left="576"/>
+      </w:pPr>
+      <w:r>
+        <w:rPr>
+          <w:rFonts w:ascii="Calibri" w:hAnsi="Calibri"/>
+          <w:color w:val="2563EB"/>
+          <w:sz w:val="19"/>
+          <w:u w:val="single"/>
+        </w:rPr>
+        <w:t>1.4 Comparative Jurisprudential Framework: Title-by-Title Precedential Integration (*The Isayeva Benchmarks*)</w:t>
+      </w:r>
+    </w:p>
+    <w:p>
+      <w:pPr>
+        <w:pStyle w:val="ListBullet"/>
+        <w:spacing w:before="20" w:after="40"/>
       </w:pPr>
       <w:r>
         <w:rPr>
@@ -2032,42 +2084,7 @@
           <w:color w:val="1E293B"/>
           <w:sz w:val="19"/>
         </w:rPr>
-        <w:t>, 18 September 2026, by Ben Bartenstein and Krishna Karra), revealing the operational role of Palantir’s Maven Smart System, Anthropic’s Claude AI integration, database synchronization disconnects, and the dismantling of CENTCOM’s civilian harm mitigation infrastructure.</w:t>
-      </w:r>
-    </w:p>
-    <w:p>
-      <w:pPr>
-        <w:spacing w:before="200" w:after="60"/>
-      </w:pPr>
-      <w:r>
-        <w:rPr>
-          <w:rFonts w:ascii="Calibri" w:hAnsi="Calibri"/>
-          <w:b/>
-          <w:color w:val="334155"/>
-          <w:sz w:val="22"/>
-        </w:rPr>
-        <w:t>1.3 Executive Summary of Determinations</w:t>
-      </w:r>
-    </w:p>
-    <w:p>
-      <w:pPr>
-        <w:spacing w:before="40" w:after="60"/>
-        <w:ind w:left="432"/>
-      </w:pPr>
-      <w:r>
-        <w:rPr>
-          <w:b/>
-          <w:sz w:val="19"/>
-        </w:rPr>
-        <w:t xml:space="preserve">8. </w:t>
-      </w:r>
-      <w:r>
-        <w:rPr>
-          <w:rFonts w:ascii="Calibri" w:hAnsi="Calibri"/>
-          <w:color w:val="1E293B"/>
-          <w:sz w:val="19"/>
-        </w:rPr>
-        <w:t>On the basis of the verified evidence set forth in this Dossier, the Panel makes the following foundational determinations:</w:t>
+        <w:t>, 18 September 2026, by Ben Bartenstein and Krishna Karra), revealing the operational role of Palantir’s Maven Smart System, Anthropic’s Claude AI integration, database synchronization disconnects, and the dismantling of CENTCOM’s civilian harm mitigation infrastructure; and</w:t>
       </w:r>
     </w:p>
     <w:p>
@@ -2079,6 +2096,141 @@
       <w:r>
         <w:rPr>
           <w:rFonts w:ascii="Calibri" w:hAnsi="Calibri"/>
+          <w:color w:val="1E293B"/>
+          <w:sz w:val="19"/>
+        </w:rPr>
+        <w:t xml:space="preserve">(iv) The canonical jurisprudence of the </w:t>
+      </w:r>
+      <w:r>
+        <w:rPr>
+          <w:rFonts w:ascii="Calibri" w:hAnsi="Calibri"/>
+          <w:b/>
+          <w:color w:val="1E293B"/>
+          <w:sz w:val="19"/>
+        </w:rPr>
+        <w:t>European Court of Human Rights (ECtHR)</w:t>
+      </w:r>
+      <w:r>
+        <w:rPr>
+          <w:rFonts w:ascii="Calibri" w:hAnsi="Calibri"/>
+          <w:color w:val="1E293B"/>
+          <w:sz w:val="19"/>
+        </w:rPr>
+        <w:t xml:space="preserve"> on kinetic aerial bombardment and the Right to Life under Article 2 ECHR, specifically the twin landmark judgments rendered on 24 February 2005: </w:t>
+      </w:r>
+      <w:r>
+        <w:rPr>
+          <w:rFonts w:ascii="Calibri" w:hAnsi="Calibri"/>
+          <w:b/>
+          <w:color w:val="1E293B"/>
+          <w:sz w:val="19"/>
+        </w:rPr>
+        <w:t>Case 03: *Isayeva v. Russia</w:t>
+      </w:r>
+      <w:r>
+        <w:rPr>
+          <w:rFonts w:ascii="Calibri" w:hAnsi="Calibri"/>
+          <w:i/>
+          <w:color w:val="1E293B"/>
+          <w:sz w:val="19"/>
+        </w:rPr>
+        <w:t xml:space="preserve"> (Katyr-Yurt Bombing, Application no. 57950/00; HUDOC [001-68381](https://hudoc.echr.coe.int/eng?i=001-68381)) and </w:t>
+      </w:r>
+      <w:r>
+        <w:rPr>
+          <w:rFonts w:ascii="Calibri" w:hAnsi="Calibri"/>
+          <w:i/>
+          <w:color w:val="1E293B"/>
+          <w:sz w:val="19"/>
+        </w:rPr>
+        <w:t xml:space="preserve">Case 19: </w:t>
+      </w:r>
+      <w:r>
+        <w:rPr>
+          <w:rFonts w:ascii="Calibri" w:hAnsi="Calibri"/>
+          <w:color w:val="1E293B"/>
+          <w:sz w:val="19"/>
+        </w:rPr>
+        <w:t>Isayeva, Yusupova and Bazayeva v. Russia</w:t>
+      </w:r>
+      <w:r>
+        <w:rPr>
+          <w:rFonts w:ascii="Calibri" w:hAnsi="Calibri"/>
+          <w:i/>
+          <w:color w:val="1E293B"/>
+          <w:sz w:val="19"/>
+        </w:rPr>
+      </w:r>
+      <w:r>
+        <w:rPr>
+          <w:rFonts w:ascii="Calibri" w:hAnsi="Calibri"/>
+          <w:color w:val="1E293B"/>
+          <w:sz w:val="19"/>
+        </w:rPr>
+        <w:t xml:space="preserve">* (Shaami-Yurt Refugee Convoy Strike, Applications nos. 57947/00, 57948/00, and 57949/00; HUDOC </w:t>
+      </w:r>
+      <w:r>
+        <w:rPr>
+          <w:rFonts w:ascii="Calibri" w:hAnsi="Calibri"/>
+          <w:color w:val="2563EB"/>
+          <w:sz w:val="19"/>
+          <w:u w:val="single"/>
+        </w:rPr>
+        <w:t>001-68379</w:t>
+      </w:r>
+      <w:r>
+        <w:rPr>
+          <w:rFonts w:ascii="Calibri" w:hAnsi="Calibri"/>
+          <w:color w:val="1E293B"/>
+          <w:sz w:val="19"/>
+        </w:rPr>
+        <w:t>).</w:t>
+      </w:r>
+    </w:p>
+    <w:p>
+      <w:pPr>
+        <w:spacing w:before="200" w:after="60"/>
+      </w:pPr>
+      <w:r>
+        <w:rPr>
+          <w:rFonts w:ascii="Calibri" w:hAnsi="Calibri"/>
+          <w:b/>
+          <w:color w:val="334155"/>
+          <w:sz w:val="22"/>
+        </w:rPr>
+        <w:t>1.3 Executive Summary of Determinations</w:t>
+      </w:r>
+    </w:p>
+    <w:p>
+      <w:pPr>
+        <w:spacing w:before="40" w:after="60"/>
+        <w:ind w:left="432"/>
+      </w:pPr>
+      <w:r>
+        <w:rPr>
+          <w:b/>
+          <w:sz w:val="19"/>
+        </w:rPr>
+        <w:t xml:space="preserve">8. </w:t>
+      </w:r>
+      <w:r>
+        <w:rPr>
+          <w:rFonts w:ascii="Calibri" w:hAnsi="Calibri"/>
+          <w:color w:val="1E293B"/>
+          <w:sz w:val="19"/>
+        </w:rPr>
+        <w:t>On the basis of the verified evidence set forth in this Dossier, the Panel makes the following foundational determinations:</w:t>
+      </w:r>
+    </w:p>
+    <w:p>
+      <w:pPr>
+        <w:pStyle w:val="ListBullet"/>
+        <w:spacing w:before="20" w:after="40"/>
+        <w:ind w:left="576"/>
+      </w:pPr>
+      <w:r>
+        <w:rPr>
+          <w:rFonts w:ascii="Calibri" w:hAnsi="Calibri"/>
           <w:b/>
           <w:color w:val="1E293B"/>
           <w:sz w:val="19"/>
@@ -2367,6 +2519,1302 @@
           <w:sz w:val="19"/>
         </w:rPr>
         <w:t xml:space="preserve"> of the United States of America under customary international law, requiring cessation, full restitution, compensation, and satisfaction.</w:t>
+      </w:r>
+    </w:p>
+    <w:p>
+      <w:pPr>
+        <w:spacing w:before="200" w:after="60"/>
+      </w:pPr>
+      <w:r>
+        <w:rPr>
+          <w:rFonts w:ascii="Calibri" w:hAnsi="Calibri"/>
+          <w:b/>
+          <w:color w:val="334155"/>
+          <w:sz w:val="22"/>
+        </w:rPr>
+        <w:t>1.4 Comparative Jurisprudential Framework: Title-by-Title Precedential Integration (*The Isayeva Benchmarks*)</w:t>
+      </w:r>
+    </w:p>
+    <w:p>
+      <w:pPr>
+        <w:spacing w:before="40" w:after="80" w:line="276" w:lineRule="auto"/>
+      </w:pPr>
+      <w:r>
+        <w:rPr>
+          <w:rFonts w:ascii="Calibri" w:hAnsi="Calibri"/>
+          <w:color w:val="1E293B"/>
+          <w:sz w:val="20"/>
+        </w:rPr>
+        <w:t xml:space="preserve">8 bis. To ensure that this Determination satisfies the highest standard of international judicial rigor, the Panel formally benchmarks its factual and legal determinations against the canonical jurisprudence of the European Court of Human Rights (ECtHR) governing kinetic aerial strikes. On February 24, 2005, the ECtHR delivered its twin landmark judgments on aerial bombardment in Chechnya: </w:t>
+      </w:r>
+      <w:r>
+        <w:rPr>
+          <w:rFonts w:ascii="Calibri" w:hAnsi="Calibri"/>
+          <w:b/>
+          <w:i/>
+          <w:color w:val="1E293B"/>
+          <w:sz w:val="20"/>
+        </w:rPr>
+        <w:t xml:space="preserve">Isayeva v. Russia* (Katyr-Yurt, App. no. 57950/00)** and </w:t>
+      </w:r>
+      <w:r>
+        <w:rPr>
+          <w:rFonts w:ascii="Calibri" w:hAnsi="Calibri"/>
+          <w:color w:val="1E293B"/>
+          <w:sz w:val="20"/>
+        </w:rPr>
+        <w:t>Isayeva, Yusupova and Bazayeva v. Russia</w:t>
+      </w:r>
+      <w:r>
+        <w:rPr>
+          <w:rFonts w:ascii="Calibri" w:hAnsi="Calibri"/>
+          <w:i/>
+          <w:color w:val="1E293B"/>
+          <w:sz w:val="20"/>
+        </w:rPr>
+        <w:t xml:space="preserve"> (Shaami-Yurt Convoy, App. nos. 57947/00, 57948/00, and 57949/00)</w:t>
+      </w:r>
+      <w:r>
+        <w:rPr>
+          <w:rFonts w:ascii="Calibri" w:hAnsi="Calibri"/>
+          <w:color w:val="1E293B"/>
+          <w:sz w:val="20"/>
+        </w:rPr>
+        <w:t>*. Together, these judgments establish the definitive international legal standards governing state liability for kinetic aerial operations in populated areas under the Right to Life (ECHR Article 2).</w:t>
+      </w:r>
+    </w:p>
+    <w:p>
+      <w:pPr>
+        <w:spacing w:before="40" w:after="80" w:line="276" w:lineRule="auto"/>
+      </w:pPr>
+      <w:r>
+        <w:rPr>
+          <w:rFonts w:ascii="Calibri" w:hAnsi="Calibri"/>
+          <w:color w:val="1E293B"/>
+          <w:sz w:val="20"/>
+        </w:rPr>
+        <w:t xml:space="preserve">8 ter. The legal findings articulated in </w:t>
+      </w:r>
+      <w:r>
+        <w:rPr>
+          <w:rFonts w:ascii="Calibri" w:hAnsi="Calibri"/>
+          <w:b/>
+          <w:color w:val="1E293B"/>
+          <w:sz w:val="20"/>
+        </w:rPr>
+        <w:t>*Isayeva, Yusupova and Bazayeva v. Russia* (HUDOC 001-68379)</w:t>
+      </w:r>
+      <w:r>
+        <w:rPr>
+          <w:rFonts w:ascii="Calibri" w:hAnsi="Calibri"/>
+          <w:color w:val="1E293B"/>
+          <w:sz w:val="20"/>
+        </w:rPr>
+        <w:t xml:space="preserve"> converge directly with every substantive title of this Master Dossier, as set forth in the comparative architecture below:</w:t>
+      </w:r>
+    </w:p>
+    <w:tbl>
+      <w:tblPr>
+        <w:tblW w:type="auto" w:w="0"/>
+        <w:jc w:val="center"/>
+        <w:tblLayout w:type="fixed"/>
+        <w:tblLook w:firstColumn="1" w:firstRow="1" w:lastColumn="0" w:lastRow="0" w:noHBand="0" w:noVBand="1" w:val="04A0"/>
+      </w:tblPr>
+      <w:tblGrid>
+        <w:gridCol w:w="2520"/>
+        <w:gridCol w:w="2520"/>
+        <w:gridCol w:w="2520"/>
+        <w:gridCol w:w="2520"/>
+      </w:tblGrid>
+      <w:tr>
+        <w:tc>
+          <w:tcPr>
+            <w:tcW w:type="dxa" w:w="2520"/>
+            <w:shd w:val="clear" w:color="auto" w:fill="E2E8F0"/>
+            <w:tcMar>
+              <w:top w:w="100" w:type="dxa"/>
+              <w:bottom w:w="100" w:type="dxa"/>
+              <w:left w:w="120" w:type="dxa"/>
+              <w:right w:w="120" w:type="dxa"/>
+            </w:tcMar>
+            <w:tcBorders>
+              <w:top w:val="single" w:sz="8" w:space="0" w:color="94A3B8"/>
+              <w:bottom w:val="single" w:sz="8" w:space="0" w:color="94A3B8"/>
+              <w:left w:val="nil"/>
+              <w:right w:val="nil"/>
+            </w:tcBorders>
+          </w:tcPr>
+          <w:p>
+            <w:pPr>
+              <w:spacing w:before="40" w:after="40"/>
+            </w:pPr>
+            <w:r>
+              <w:rPr>
+                <w:rFonts w:ascii="Calibri" w:hAnsi="Calibri"/>
+                <w:b/>
+                <w:color w:val="0F172A"/>
+                <w:sz w:val="18"/>
+              </w:rPr>
+              <w:t>Precedential Dimension</w:t>
+            </w:r>
+          </w:p>
+        </w:tc>
+        <w:tc>
+          <w:tcPr>
+            <w:tcW w:type="dxa" w:w="2520"/>
+            <w:shd w:val="clear" w:color="auto" w:fill="E2E8F0"/>
+            <w:tcMar>
+              <w:top w:w="100" w:type="dxa"/>
+              <w:bottom w:w="100" w:type="dxa"/>
+              <w:left w:w="120" w:type="dxa"/>
+              <w:right w:w="120" w:type="dxa"/>
+            </w:tcMar>
+            <w:tcBorders>
+              <w:top w:val="single" w:sz="8" w:space="0" w:color="94A3B8"/>
+              <w:bottom w:val="single" w:sz="8" w:space="0" w:color="94A3B8"/>
+              <w:left w:val="nil"/>
+              <w:right w:val="nil"/>
+            </w:tcBorders>
+          </w:tcPr>
+          <w:p>
+            <w:pPr>
+              <w:spacing w:before="40" w:after="40"/>
+            </w:pPr>
+            <w:r>
+              <w:rPr>
+                <w:rFonts w:ascii="Calibri" w:hAnsi="Calibri"/>
+                <w:b/>
+                <w:color w:val="0F172A"/>
+                <w:sz w:val="18"/>
+              </w:rPr>
+              <w:t>Holdings in *Isayeva, Yusupova &amp; Bazayeva* (ECtHR 2005)</w:t>
+            </w:r>
+          </w:p>
+        </w:tc>
+        <w:tc>
+          <w:tcPr>
+            <w:tcW w:type="dxa" w:w="2520"/>
+            <w:shd w:val="clear" w:color="auto" w:fill="E2E8F0"/>
+            <w:tcMar>
+              <w:top w:w="100" w:type="dxa"/>
+              <w:bottom w:w="100" w:type="dxa"/>
+              <w:left w:w="120" w:type="dxa"/>
+              <w:right w:w="120" w:type="dxa"/>
+            </w:tcMar>
+            <w:tcBorders>
+              <w:top w:val="single" w:sz="8" w:space="0" w:color="94A3B8"/>
+              <w:bottom w:val="single" w:sz="8" w:space="0" w:color="94A3B8"/>
+              <w:left w:val="nil"/>
+              <w:right w:val="nil"/>
+            </w:tcBorders>
+          </w:tcPr>
+          <w:p>
+            <w:pPr>
+              <w:spacing w:before="40" w:after="40"/>
+            </w:pPr>
+            <w:r>
+              <w:rPr>
+                <w:rFonts w:ascii="Calibri" w:hAnsi="Calibri"/>
+                <w:b/>
+                <w:color w:val="0F172A"/>
+                <w:sz w:val="18"/>
+              </w:rPr>
+              <w:t>Factual Correlative in Minab Elementary School Strike</w:t>
+            </w:r>
+          </w:p>
+        </w:tc>
+        <w:tc>
+          <w:tcPr>
+            <w:tcW w:type="dxa" w:w="2520"/>
+            <w:shd w:val="clear" w:color="auto" w:fill="E2E8F0"/>
+            <w:tcMar>
+              <w:top w:w="100" w:type="dxa"/>
+              <w:bottom w:w="100" w:type="dxa"/>
+              <w:left w:w="120" w:type="dxa"/>
+              <w:right w:w="120" w:type="dxa"/>
+            </w:tcMar>
+            <w:tcBorders>
+              <w:top w:val="single" w:sz="8" w:space="0" w:color="94A3B8"/>
+              <w:bottom w:val="single" w:sz="8" w:space="0" w:color="94A3B8"/>
+              <w:left w:val="nil"/>
+              <w:right w:val="nil"/>
+            </w:tcBorders>
+          </w:tcPr>
+          <w:p>
+            <w:pPr>
+              <w:spacing w:before="40" w:after="40"/>
+            </w:pPr>
+            <w:r>
+              <w:rPr>
+                <w:rFonts w:ascii="Calibri" w:hAnsi="Calibri"/>
+                <w:b/>
+                <w:color w:val="0F172A"/>
+                <w:sz w:val="18"/>
+              </w:rPr>
+              <w:t>Master Dossier Incorporation &amp; Location</w:t>
+            </w:r>
+          </w:p>
+        </w:tc>
+      </w:tr>
+      <w:tr>
+        <w:tc>
+          <w:tcPr>
+            <w:tcW w:type="dxa" w:w="2520"/>
+            <w:shd w:val="clear" w:color="auto" w:fill="F8FAFC"/>
+            <w:tcMar>
+              <w:top w:w="80" w:type="dxa"/>
+              <w:bottom w:w="80" w:type="dxa"/>
+              <w:left w:w="120" w:type="dxa"/>
+              <w:right w:w="120" w:type="dxa"/>
+            </w:tcMar>
+            <w:tcBorders>
+              <w:top w:val="nil"/>
+              <w:bottom w:val="single" w:sz="4" w:space="0" w:color="E2E8F0"/>
+              <w:left w:val="nil"/>
+              <w:right w:val="nil"/>
+            </w:tcBorders>
+          </w:tcPr>
+          <w:p>
+            <w:pPr>
+              <w:spacing w:before="40" w:after="40"/>
+            </w:pPr>
+            <w:r>
+              <w:rPr>
+                <w:rFonts w:ascii="Calibri" w:hAnsi="Calibri"/>
+                <w:b/>
+                <w:color w:val="1E293B"/>
+                <w:sz w:val="17"/>
+              </w:rPr>
+              <w:t>I. Rebuttal of "Dynamic Target" &amp; "Sudden Appearance" Defenses</w:t>
+            </w:r>
+          </w:p>
+        </w:tc>
+        <w:tc>
+          <w:tcPr>
+            <w:tcW w:type="dxa" w:w="2520"/>
+            <w:shd w:val="clear" w:color="auto" w:fill="F8FAFC"/>
+            <w:tcMar>
+              <w:top w:w="80" w:type="dxa"/>
+              <w:bottom w:w="80" w:type="dxa"/>
+              <w:left w:w="120" w:type="dxa"/>
+              <w:right w:w="120" w:type="dxa"/>
+            </w:tcMar>
+            <w:tcBorders>
+              <w:top w:val="nil"/>
+              <w:bottom w:val="single" w:sz="4" w:space="0" w:color="E2E8F0"/>
+              <w:left w:val="nil"/>
+              <w:right w:val="nil"/>
+            </w:tcBorders>
+          </w:tcPr>
+          <w:p>
+            <w:pPr>
+              <w:spacing w:before="40" w:after="40"/>
+            </w:pPr>
+            <w:r>
+              <w:rPr>
+                <w:rFonts w:ascii="Calibri" w:hAnsi="Calibri"/>
+                <w:color w:val="1E293B"/>
+                <w:sz w:val="17"/>
+              </w:rPr>
+              <w:t>Rejects state defense that civilians "suddenly appeared" or were obscured near target; holds that daylight, low flight passes, and extended duration make civilian presence unmistakable (§§ 192–194).</w:t>
+            </w:r>
+          </w:p>
+        </w:tc>
+        <w:tc>
+          <w:tcPr>
+            <w:tcW w:type="dxa" w:w="2520"/>
+            <w:shd w:val="clear" w:color="auto" w:fill="F8FAFC"/>
+            <w:tcMar>
+              <w:top w:w="80" w:type="dxa"/>
+              <w:bottom w:w="80" w:type="dxa"/>
+              <w:left w:w="120" w:type="dxa"/>
+              <w:right w:w="120" w:type="dxa"/>
+            </w:tcMar>
+            <w:tcBorders>
+              <w:top w:val="nil"/>
+              <w:bottom w:val="single" w:sz="4" w:space="0" w:color="E2E8F0"/>
+              <w:left w:val="nil"/>
+              <w:right w:val="nil"/>
+            </w:tcBorders>
+          </w:tcPr>
+          <w:p>
+            <w:pPr>
+              <w:spacing w:before="40" w:after="40"/>
+            </w:pPr>
+            <w:r>
+              <w:rPr>
+                <w:rFonts w:ascii="Calibri" w:hAnsi="Calibri"/>
+                <w:color w:val="1E293B"/>
+                <w:sz w:val="17"/>
+              </w:rPr>
+              <w:t>Ten-year-old operational primary school operating during regular Saturday morning classes cannot be excused as an unexpected dynamic presence.</w:t>
+            </w:r>
+          </w:p>
+        </w:tc>
+        <w:tc>
+          <w:tcPr>
+            <w:tcW w:type="dxa" w:w="2520"/>
+            <w:shd w:val="clear" w:color="auto" w:fill="F8FAFC"/>
+            <w:tcMar>
+              <w:top w:w="80" w:type="dxa"/>
+              <w:bottom w:w="80" w:type="dxa"/>
+              <w:left w:w="120" w:type="dxa"/>
+              <w:right w:w="120" w:type="dxa"/>
+            </w:tcMar>
+            <w:tcBorders>
+              <w:top w:val="nil"/>
+              <w:bottom w:val="single" w:sz="4" w:space="0" w:color="E2E8F0"/>
+              <w:left w:val="nil"/>
+              <w:right w:val="nil"/>
+            </w:tcBorders>
+          </w:tcPr>
+          <w:p>
+            <w:pPr>
+              <w:spacing w:before="40" w:after="40"/>
+            </w:pPr>
+            <w:r>
+              <w:rPr>
+                <w:rFonts w:ascii="Calibri" w:hAnsi="Calibri"/>
+                <w:b/>
+                <w:color w:val="1E293B"/>
+                <w:sz w:val="17"/>
+              </w:rPr>
+              <w:t>[Chapter VI, § 6.3 (¶ 70 bis)](#chapter-6-3)</w:t>
+            </w:r>
+            <w:r>
+              <w:rPr>
+                <w:rFonts w:ascii="Calibri" w:hAnsi="Calibri"/>
+                <w:color w:val="1E293B"/>
+                <w:sz w:val="17"/>
+              </w:rPr>
+              <w:t>: Rebuttal of Coordinate Error Defense</w:t>
+            </w:r>
+          </w:p>
+        </w:tc>
+      </w:tr>
+      <w:tr>
+        <w:tc>
+          <w:tcPr>
+            <w:tcW w:type="dxa" w:w="2520"/>
+            <w:shd w:val="clear" w:color="auto" w:fill="FFFFFF"/>
+            <w:tcMar>
+              <w:top w:w="80" w:type="dxa"/>
+              <w:bottom w:w="80" w:type="dxa"/>
+              <w:left w:w="120" w:type="dxa"/>
+              <w:right w:w="120" w:type="dxa"/>
+            </w:tcMar>
+            <w:tcBorders>
+              <w:top w:val="nil"/>
+              <w:bottom w:val="single" w:sz="4" w:space="0" w:color="E2E8F0"/>
+              <w:left w:val="nil"/>
+              <w:right w:val="nil"/>
+            </w:tcBorders>
+          </w:tcPr>
+          <w:p>
+            <w:pPr>
+              <w:spacing w:before="40" w:after="40"/>
+            </w:pPr>
+            <w:r>
+              <w:rPr>
+                <w:rFonts w:ascii="Calibri" w:hAnsi="Calibri"/>
+                <w:b/>
+                <w:color w:val="1E293B"/>
+                <w:sz w:val="17"/>
+              </w:rPr>
+              <w:t>II. Precautionary "Planning &amp; Control" Standard</w:t>
+            </w:r>
+          </w:p>
+        </w:tc>
+        <w:tc>
+          <w:tcPr>
+            <w:tcW w:type="dxa" w:w="2520"/>
+            <w:shd w:val="clear" w:color="auto" w:fill="FFFFFF"/>
+            <w:tcMar>
+              <w:top w:w="80" w:type="dxa"/>
+              <w:bottom w:w="80" w:type="dxa"/>
+              <w:left w:w="120" w:type="dxa"/>
+              <w:right w:w="120" w:type="dxa"/>
+            </w:tcMar>
+            <w:tcBorders>
+              <w:top w:val="nil"/>
+              <w:bottom w:val="single" w:sz="4" w:space="0" w:color="E2E8F0"/>
+              <w:left w:val="nil"/>
+              <w:right w:val="nil"/>
+            </w:tcBorders>
+          </w:tcPr>
+          <w:p>
+            <w:pPr>
+              <w:spacing w:before="40" w:after="40"/>
+            </w:pPr>
+            <w:r>
+              <w:rPr>
+                <w:rFonts w:ascii="Calibri" w:hAnsi="Calibri"/>
+                <w:color w:val="1E293B"/>
+                <w:sz w:val="17"/>
+              </w:rPr>
+              <w:t>State liability under Article 2 turns upon whether operations were planned and controlled to minimise risk to life; institutional siloing between civilian movements and air planners constitutes gross negligence (§§ 171, 186–189, 199).</w:t>
+            </w:r>
+          </w:p>
+        </w:tc>
+        <w:tc>
+          <w:tcPr>
+            <w:tcW w:type="dxa" w:w="2520"/>
+            <w:shd w:val="clear" w:color="auto" w:fill="FFFFFF"/>
+            <w:tcMar>
+              <w:top w:w="80" w:type="dxa"/>
+              <w:bottom w:w="80" w:type="dxa"/>
+              <w:left w:w="120" w:type="dxa"/>
+              <w:right w:w="120" w:type="dxa"/>
+            </w:tcMar>
+            <w:tcBorders>
+              <w:top w:val="nil"/>
+              <w:bottom w:val="single" w:sz="4" w:space="0" w:color="E2E8F0"/>
+              <w:left w:val="nil"/>
+              <w:right w:val="nil"/>
+            </w:tcBorders>
+          </w:tcPr>
+          <w:p>
+            <w:pPr>
+              <w:spacing w:before="40" w:after="40"/>
+            </w:pPr>
+            <w:r>
+              <w:rPr>
+                <w:rFonts w:ascii="Calibri" w:hAnsi="Calibri"/>
+                <w:color w:val="1E293B"/>
+                <w:sz w:val="17"/>
+              </w:rPr>
+              <w:t>CENTCOM and DIA operated on stale pre-2016 intelligence silos, eliminated civilian harm mitigation analysts (10 down to 1), and bypassed forward verification.</w:t>
+            </w:r>
+          </w:p>
+        </w:tc>
+        <w:tc>
+          <w:tcPr>
+            <w:tcW w:type="dxa" w:w="2520"/>
+            <w:shd w:val="clear" w:color="auto" w:fill="FFFFFF"/>
+            <w:tcMar>
+              <w:top w:w="80" w:type="dxa"/>
+              <w:bottom w:w="80" w:type="dxa"/>
+              <w:left w:w="120" w:type="dxa"/>
+              <w:right w:w="120" w:type="dxa"/>
+            </w:tcMar>
+            <w:tcBorders>
+              <w:top w:val="nil"/>
+              <w:bottom w:val="single" w:sz="4" w:space="0" w:color="E2E8F0"/>
+              <w:left w:val="nil"/>
+              <w:right w:val="nil"/>
+            </w:tcBorders>
+          </w:tcPr>
+          <w:p>
+            <w:pPr>
+              <w:spacing w:before="40" w:after="40"/>
+            </w:pPr>
+            <w:r>
+              <w:rPr>
+                <w:rFonts w:ascii="Calibri" w:hAnsi="Calibri"/>
+                <w:b/>
+                <w:color w:val="1E293B"/>
+                <w:sz w:val="17"/>
+              </w:rPr>
+              <w:t>[Chapter VII, § 7.2 (¶ 81 ter)](#chapter-7-2)</w:t>
+            </w:r>
+            <w:r>
+              <w:rPr>
+                <w:rFonts w:ascii="Calibri" w:hAnsi="Calibri"/>
+                <w:color w:val="1E293B"/>
+                <w:sz w:val="17"/>
+              </w:rPr>
+              <w:t>: Affirmative Duty to Take Feasible Precautions</w:t>
+            </w:r>
+          </w:p>
+        </w:tc>
+      </w:tr>
+      <w:tr>
+        <w:tc>
+          <w:tcPr>
+            <w:tcW w:type="dxa" w:w="2520"/>
+            <w:shd w:val="clear" w:color="auto" w:fill="F8FAFC"/>
+            <w:tcMar>
+              <w:top w:w="80" w:type="dxa"/>
+              <w:bottom w:w="80" w:type="dxa"/>
+              <w:left w:w="120" w:type="dxa"/>
+              <w:right w:w="120" w:type="dxa"/>
+            </w:tcMar>
+            <w:tcBorders>
+              <w:top w:val="nil"/>
+              <w:bottom w:val="single" w:sz="4" w:space="0" w:color="E2E8F0"/>
+              <w:left w:val="nil"/>
+              <w:right w:val="nil"/>
+            </w:tcBorders>
+          </w:tcPr>
+          <w:p>
+            <w:pPr>
+              <w:spacing w:before="40" w:after="40"/>
+            </w:pPr>
+            <w:r>
+              <w:rPr>
+                <w:rFonts w:ascii="Calibri" w:hAnsi="Calibri"/>
+                <w:b/>
+                <w:color w:val="1E293B"/>
+                <w:sz w:val="17"/>
+              </w:rPr>
+              <w:t>III. Weapons Disproportionality in Civilian Sanctuaries</w:t>
+            </w:r>
+          </w:p>
+        </w:tc>
+        <w:tc>
+          <w:tcPr>
+            <w:tcW w:type="dxa" w:w="2520"/>
+            <w:shd w:val="clear" w:color="auto" w:fill="F8FAFC"/>
+            <w:tcMar>
+              <w:top w:w="80" w:type="dxa"/>
+              <w:bottom w:w="80" w:type="dxa"/>
+              <w:left w:w="120" w:type="dxa"/>
+              <w:right w:w="120" w:type="dxa"/>
+            </w:tcMar>
+            <w:tcBorders>
+              <w:top w:val="nil"/>
+              <w:bottom w:val="single" w:sz="4" w:space="0" w:color="E2E8F0"/>
+              <w:left w:val="nil"/>
+              <w:right w:val="nil"/>
+            </w:tcBorders>
+          </w:tcPr>
+          <w:p>
+            <w:pPr>
+              <w:spacing w:before="40" w:after="40"/>
+            </w:pPr>
+            <w:r>
+              <w:rPr>
+                <w:rFonts w:ascii="Calibri" w:hAnsi="Calibri"/>
+                <w:color w:val="1E293B"/>
+                <w:sz w:val="17"/>
+              </w:rPr>
+              <w:t>Firing twelve heavy S-24 blast-fragmentation missiles (blast radius 300–800m) into a civilian roadway is inherently disproportionate, rendering slaughter mathematically certain (§§ 195, 199).</w:t>
+            </w:r>
+          </w:p>
+        </w:tc>
+        <w:tc>
+          <w:tcPr>
+            <w:tcW w:type="dxa" w:w="2520"/>
+            <w:shd w:val="clear" w:color="auto" w:fill="F8FAFC"/>
+            <w:tcMar>
+              <w:top w:w="80" w:type="dxa"/>
+              <w:bottom w:w="80" w:type="dxa"/>
+              <w:left w:w="120" w:type="dxa"/>
+              <w:right w:w="120" w:type="dxa"/>
+            </w:tcMar>
+            <w:tcBorders>
+              <w:top w:val="nil"/>
+              <w:bottom w:val="single" w:sz="4" w:space="0" w:color="E2E8F0"/>
+              <w:left w:val="nil"/>
+              <w:right w:val="nil"/>
+            </w:tcBorders>
+          </w:tcPr>
+          <w:p>
+            <w:pPr>
+              <w:spacing w:before="40" w:after="40"/>
+            </w:pPr>
+            <w:r>
+              <w:rPr>
+                <w:rFonts w:ascii="Calibri" w:hAnsi="Calibri"/>
+                <w:color w:val="1E293B"/>
+                <w:sz w:val="17"/>
+              </w:rPr>
+              <w:t>Detonating three 1,000-lb WDU-36/B warheads (casualty radius &gt; 300m) exactly 42m from an active school makes child slaughter mathematically inevitable.</w:t>
+            </w:r>
+          </w:p>
+        </w:tc>
+        <w:tc>
+          <w:tcPr>
+            <w:tcW w:type="dxa" w:w="2520"/>
+            <w:shd w:val="clear" w:color="auto" w:fill="F8FAFC"/>
+            <w:tcMar>
+              <w:top w:w="80" w:type="dxa"/>
+              <w:bottom w:w="80" w:type="dxa"/>
+              <w:left w:w="120" w:type="dxa"/>
+              <w:right w:w="120" w:type="dxa"/>
+            </w:tcMar>
+            <w:tcBorders>
+              <w:top w:val="nil"/>
+              <w:bottom w:val="single" w:sz="4" w:space="0" w:color="E2E8F0"/>
+              <w:left w:val="nil"/>
+              <w:right w:val="nil"/>
+            </w:tcBorders>
+          </w:tcPr>
+          <w:p>
+            <w:pPr>
+              <w:spacing w:before="40" w:after="40"/>
+            </w:pPr>
+            <w:r>
+              <w:rPr>
+                <w:rFonts w:ascii="Calibri" w:hAnsi="Calibri"/>
+                <w:b/>
+                <w:color w:val="1E293B"/>
+                <w:sz w:val="17"/>
+              </w:rPr>
+              <w:t>[Chapter VII, § 7.3 (¶¶ 83–83 bis)](#chapter-7-3)</w:t>
+            </w:r>
+            <w:r>
+              <w:rPr>
+                <w:rFonts w:ascii="Calibri" w:hAnsi="Calibri"/>
+                <w:color w:val="1E293B"/>
+                <w:sz w:val="17"/>
+              </w:rPr>
+              <w:t>: Principle of Proportionality (</w:t>
+            </w:r>
+            <w:r>
+              <w:rPr>
+                <w:rFonts w:ascii="Calibri" w:hAnsi="Calibri"/>
+                <w:i/>
+                <w:color w:val="1E293B"/>
+                <w:sz w:val="17"/>
+              </w:rPr>
+              <w:t>The Isayeva Jurisprudence</w:t>
+            </w:r>
+            <w:r>
+              <w:rPr>
+                <w:rFonts w:ascii="Calibri" w:hAnsi="Calibri"/>
+                <w:color w:val="1E293B"/>
+                <w:sz w:val="17"/>
+              </w:rPr>
+              <w:t>)</w:t>
+            </w:r>
+          </w:p>
+        </w:tc>
+      </w:tr>
+      <w:tr>
+        <w:tc>
+          <w:tcPr>
+            <w:tcW w:type="dxa" w:w="2520"/>
+            <w:shd w:val="clear" w:color="auto" w:fill="FFFFFF"/>
+            <w:tcMar>
+              <w:top w:w="80" w:type="dxa"/>
+              <w:bottom w:w="80" w:type="dxa"/>
+              <w:left w:w="120" w:type="dxa"/>
+              <w:right w:w="120" w:type="dxa"/>
+            </w:tcMar>
+            <w:tcBorders>
+              <w:top w:val="nil"/>
+              <w:bottom w:val="single" w:sz="4" w:space="0" w:color="E2E8F0"/>
+              <w:left w:val="nil"/>
+              <w:right w:val="nil"/>
+            </w:tcBorders>
+          </w:tcPr>
+          <w:p>
+            <w:pPr>
+              <w:spacing w:before="40" w:after="40"/>
+            </w:pPr>
+            <w:r>
+              <w:rPr>
+                <w:rFonts w:ascii="Calibri" w:hAnsi="Calibri"/>
+                <w:b/>
+                <w:color w:val="1E293B"/>
+                <w:sz w:val="17"/>
+              </w:rPr>
+              <w:t>IV. Upstream Concentration of Culpability</w:t>
+            </w:r>
+          </w:p>
+        </w:tc>
+        <w:tc>
+          <w:tcPr>
+            <w:tcW w:type="dxa" w:w="2520"/>
+            <w:shd w:val="clear" w:color="auto" w:fill="FFFFFF"/>
+            <w:tcMar>
+              <w:top w:w="80" w:type="dxa"/>
+              <w:bottom w:w="80" w:type="dxa"/>
+              <w:left w:w="120" w:type="dxa"/>
+              <w:right w:w="120" w:type="dxa"/>
+            </w:tcMar>
+            <w:tcBorders>
+              <w:top w:val="nil"/>
+              <w:bottom w:val="single" w:sz="4" w:space="0" w:color="E2E8F0"/>
+              <w:left w:val="nil"/>
+              <w:right w:val="nil"/>
+            </w:tcBorders>
+          </w:tcPr>
+          <w:p>
+            <w:pPr>
+              <w:spacing w:before="40" w:after="40"/>
+            </w:pPr>
+            <w:r>
+              <w:rPr>
+                <w:rFonts w:ascii="Calibri" w:hAnsi="Calibri"/>
+                <w:color w:val="1E293B"/>
+                <w:sz w:val="17"/>
+              </w:rPr>
+              <w:t>Exonerates tactical pilots who executed assigned flight orders; concentrates 100% of state and operational responsibility upstream upon mission planners and commanders (§§ 171, 187–188, 199–200).</w:t>
+            </w:r>
+          </w:p>
+        </w:tc>
+        <w:tc>
+          <w:tcPr>
+            <w:tcW w:type="dxa" w:w="2520"/>
+            <w:shd w:val="clear" w:color="auto" w:fill="FFFFFF"/>
+            <w:tcMar>
+              <w:top w:w="80" w:type="dxa"/>
+              <w:bottom w:w="80" w:type="dxa"/>
+              <w:left w:w="120" w:type="dxa"/>
+              <w:right w:w="120" w:type="dxa"/>
+            </w:tcMar>
+            <w:tcBorders>
+              <w:top w:val="nil"/>
+              <w:bottom w:val="single" w:sz="4" w:space="0" w:color="E2E8F0"/>
+              <w:left w:val="nil"/>
+              <w:right w:val="nil"/>
+            </w:tcBorders>
+          </w:tcPr>
+          <w:p>
+            <w:pPr>
+              <w:spacing w:before="40" w:after="40"/>
+            </w:pPr>
+            <w:r>
+              <w:rPr>
+                <w:rFonts w:ascii="Calibri" w:hAnsi="Calibri"/>
+                <w:color w:val="1E293B"/>
+                <w:sz w:val="17"/>
+              </w:rPr>
+              <w:t xml:space="preserve">Naval launch crews aboard USS </w:t>
+            </w:r>
+            <w:r>
+              <w:rPr>
+                <w:rFonts w:ascii="Calibri" w:hAnsi="Calibri"/>
+                <w:i/>
+                <w:color w:val="1E293B"/>
+                <w:sz w:val="17"/>
+              </w:rPr>
+              <w:t>Abraham Lincoln</w:t>
+            </w:r>
+            <w:r>
+              <w:rPr>
+                <w:rFonts w:ascii="Calibri" w:hAnsi="Calibri"/>
+                <w:color w:val="1E293B"/>
+                <w:sz w:val="17"/>
+              </w:rPr>
+              <w:t xml:space="preserve"> bear zero culpability; liability concentrates entirely upstream on DIA nominators, CENTCOM Target Review Boards, and AI pipeline supervisors.</w:t>
+            </w:r>
+          </w:p>
+        </w:tc>
+        <w:tc>
+          <w:tcPr>
+            <w:tcW w:type="dxa" w:w="2520"/>
+            <w:shd w:val="clear" w:color="auto" w:fill="FFFFFF"/>
+            <w:tcMar>
+              <w:top w:w="80" w:type="dxa"/>
+              <w:bottom w:w="80" w:type="dxa"/>
+              <w:left w:w="120" w:type="dxa"/>
+              <w:right w:w="120" w:type="dxa"/>
+            </w:tcMar>
+            <w:tcBorders>
+              <w:top w:val="nil"/>
+              <w:bottom w:val="single" w:sz="4" w:space="0" w:color="E2E8F0"/>
+              <w:left w:val="nil"/>
+              <w:right w:val="nil"/>
+            </w:tcBorders>
+          </w:tcPr>
+          <w:p>
+            <w:pPr>
+              <w:spacing w:before="40" w:after="40"/>
+            </w:pPr>
+            <w:r>
+              <w:rPr>
+                <w:rFonts w:ascii="Calibri" w:hAnsi="Calibri"/>
+                <w:b/>
+                <w:color w:val="1E293B"/>
+                <w:sz w:val="17"/>
+              </w:rPr>
+              <w:t>[Chapter VIII, § 8.1 (¶ 88 bis)](#chapter-8-1)</w:t>
+            </w:r>
+            <w:r>
+              <w:rPr>
+                <w:rFonts w:ascii="Calibri" w:hAnsi="Calibri"/>
+                <w:color w:val="1E293B"/>
+                <w:sz w:val="17"/>
+              </w:rPr>
+              <w:t>: Upstream Concentration of Liability (NATO § 85 Principle)</w:t>
+            </w:r>
+          </w:p>
+        </w:tc>
+      </w:tr>
+      <w:tr>
+        <w:tc>
+          <w:tcPr>
+            <w:tcW w:type="dxa" w:w="2520"/>
+            <w:shd w:val="clear" w:color="auto" w:fill="F8FAFC"/>
+            <w:tcMar>
+              <w:top w:w="80" w:type="dxa"/>
+              <w:bottom w:w="80" w:type="dxa"/>
+              <w:left w:w="120" w:type="dxa"/>
+              <w:right w:w="120" w:type="dxa"/>
+            </w:tcMar>
+            <w:tcBorders>
+              <w:top w:val="nil"/>
+              <w:bottom w:val="single" w:sz="4" w:space="0" w:color="E2E8F0"/>
+              <w:left w:val="nil"/>
+              <w:right w:val="nil"/>
+            </w:tcBorders>
+          </w:tcPr>
+          <w:p>
+            <w:pPr>
+              <w:spacing w:before="40" w:after="40"/>
+            </w:pPr>
+            <w:r>
+              <w:rPr>
+                <w:rFonts w:ascii="Calibri" w:hAnsi="Calibri"/>
+                <w:b/>
+                <w:color w:val="1E293B"/>
+                <w:sz w:val="17"/>
+              </w:rPr>
+              <w:t>V. Autonomous Procedural Duty to Investigate</w:t>
+            </w:r>
+          </w:p>
+        </w:tc>
+        <w:tc>
+          <w:tcPr>
+            <w:tcW w:type="dxa" w:w="2520"/>
+            <w:shd w:val="clear" w:color="auto" w:fill="F8FAFC"/>
+            <w:tcMar>
+              <w:top w:w="80" w:type="dxa"/>
+              <w:bottom w:w="80" w:type="dxa"/>
+              <w:left w:w="120" w:type="dxa"/>
+              <w:right w:w="120" w:type="dxa"/>
+            </w:tcMar>
+            <w:tcBorders>
+              <w:top w:val="nil"/>
+              <w:bottom w:val="single" w:sz="4" w:space="0" w:color="E2E8F0"/>
+              <w:left w:val="nil"/>
+              <w:right w:val="nil"/>
+            </w:tcBorders>
+          </w:tcPr>
+          <w:p>
+            <w:pPr>
+              <w:spacing w:before="40" w:after="40"/>
+            </w:pPr>
+            <w:r>
+              <w:rPr>
+                <w:rFonts w:ascii="Calibri" w:hAnsi="Calibri"/>
+                <w:color w:val="1E293B"/>
+                <w:sz w:val="17"/>
+              </w:rPr>
+              <w:t>Establishes autonomous, non-derogable procedural criteria for lethal force inquiries: promptness, independence, command record review, and victim participation; self-exonerating military probes breach Art. 2 (§§ 208–225).</w:t>
+            </w:r>
+          </w:p>
+        </w:tc>
+        <w:tc>
+          <w:tcPr>
+            <w:tcW w:type="dxa" w:w="2520"/>
+            <w:shd w:val="clear" w:color="auto" w:fill="F8FAFC"/>
+            <w:tcMar>
+              <w:top w:w="80" w:type="dxa"/>
+              <w:bottom w:w="80" w:type="dxa"/>
+              <w:left w:w="120" w:type="dxa"/>
+              <w:right w:w="120" w:type="dxa"/>
+            </w:tcMar>
+            <w:tcBorders>
+              <w:top w:val="nil"/>
+              <w:bottom w:val="single" w:sz="4" w:space="0" w:color="E2E8F0"/>
+              <w:left w:val="nil"/>
+              <w:right w:val="nil"/>
+            </w:tcBorders>
+          </w:tcPr>
+          <w:p>
+            <w:pPr>
+              <w:spacing w:before="40" w:after="40"/>
+            </w:pPr>
+            <w:r>
+              <w:rPr>
+                <w:rFonts w:ascii="Calibri" w:hAnsi="Calibri"/>
+                <w:color w:val="1E293B"/>
+                <w:sz w:val="17"/>
+              </w:rPr>
+              <w:t>CENTCOM’s internal AR 15-6 review concealed targeting logs and excluded victims, activating the subsidiary jurisdiction of European universal jurisdiction magistrates.</w:t>
+            </w:r>
+          </w:p>
+        </w:tc>
+        <w:tc>
+          <w:tcPr>
+            <w:tcW w:type="dxa" w:w="2520"/>
+            <w:shd w:val="clear" w:color="auto" w:fill="F8FAFC"/>
+            <w:tcMar>
+              <w:top w:w="80" w:type="dxa"/>
+              <w:bottom w:w="80" w:type="dxa"/>
+              <w:left w:w="120" w:type="dxa"/>
+              <w:right w:w="120" w:type="dxa"/>
+            </w:tcMar>
+            <w:tcBorders>
+              <w:top w:val="nil"/>
+              <w:bottom w:val="single" w:sz="4" w:space="0" w:color="E2E8F0"/>
+              <w:left w:val="nil"/>
+              <w:right w:val="nil"/>
+            </w:tcBorders>
+          </w:tcPr>
+          <w:p>
+            <w:pPr>
+              <w:spacing w:before="40" w:after="40"/>
+            </w:pPr>
+            <w:r>
+              <w:rPr>
+                <w:rFonts w:ascii="Calibri" w:hAnsi="Calibri"/>
+                <w:b/>
+                <w:color w:val="1E293B"/>
+                <w:sz w:val="17"/>
+              </w:rPr>
+              <w:t>[Chapter IX, § 9.3 (¶ 94 bis)](#chapter-9-3)</w:t>
+            </w:r>
+            <w:r>
+              <w:rPr>
+                <w:rFonts w:ascii="Calibri" w:hAnsi="Calibri"/>
+                <w:color w:val="1E293B"/>
+                <w:sz w:val="17"/>
+              </w:rPr>
+              <w:t>: European Detachable Procedural Obligation (</w:t>
+            </w:r>
+            <w:r>
+              <w:rPr>
+                <w:rFonts w:ascii="Calibri" w:hAnsi="Calibri"/>
+                <w:i/>
+                <w:color w:val="1E293B"/>
+                <w:sz w:val="17"/>
+              </w:rPr>
+              <w:t>Hanan</w:t>
+            </w:r>
+            <w:r>
+              <w:rPr>
+                <w:rFonts w:ascii="Calibri" w:hAnsi="Calibri"/>
+                <w:color w:val="1E293B"/>
+                <w:sz w:val="17"/>
+              </w:rPr>
+              <w:t xml:space="preserve"> &amp; </w:t>
+            </w:r>
+            <w:r>
+              <w:rPr>
+                <w:rFonts w:ascii="Calibri" w:hAnsi="Calibri"/>
+                <w:i/>
+                <w:color w:val="1E293B"/>
+                <w:sz w:val="17"/>
+              </w:rPr>
+              <w:t>Isayeva</w:t>
+            </w:r>
+            <w:r>
+              <w:rPr>
+                <w:rFonts w:ascii="Calibri" w:hAnsi="Calibri"/>
+                <w:color w:val="1E293B"/>
+                <w:sz w:val="17"/>
+              </w:rPr>
+              <w:t>)</w:t>
+            </w:r>
+          </w:p>
+        </w:tc>
+      </w:tr>
+    </w:tbl>
+    <w:p>
+      <w:pPr>
+        <w:spacing w:after="120"/>
+      </w:pPr>
+    </w:p>
+    <w:p>
+      <w:pPr>
+        <w:spacing w:before="40" w:after="80" w:line="276" w:lineRule="auto"/>
+      </w:pPr>
+      <w:r>
+        <w:rPr>
+          <w:rFonts w:ascii="Calibri" w:hAnsi="Calibri"/>
+          <w:color w:val="1E293B"/>
+          <w:sz w:val="20"/>
+        </w:rPr>
+        <w:t xml:space="preserve">8 quater. </w:t>
+      </w:r>
+      <w:r>
+        <w:rPr>
+          <w:rFonts w:ascii="Calibri" w:hAnsi="Calibri"/>
+          <w:b/>
+          <w:color w:val="1E293B"/>
+          <w:sz w:val="20"/>
+        </w:rPr>
+        <w:t>Title-by-Title Legal Development Across the Master Dossier:</w:t>
+      </w:r>
+    </w:p>
+    <w:p>
+      <w:pPr>
+        <w:pStyle w:val="ListBullet"/>
+        <w:spacing w:before="20" w:after="40"/>
+      </w:pPr>
+      <w:r>
+        <w:rPr>
+          <w:rFonts w:ascii="Calibri" w:hAnsi="Calibri"/>
+          <w:b/>
+          <w:color w:val="1E293B"/>
+          <w:sz w:val="19"/>
+        </w:rPr>
+        <w:t>(1) Title: Chapter VI, Section 6.3 — Rebuttal of the "Dynamic Target" &amp; "Sudden Civilian Emergence" Defense ([¶ 70 bis](#chapter-6-3)):</w:t>
+      </w:r>
+      <w:r>
+        <w:rPr>
+          <w:rFonts w:ascii="Calibri" w:hAnsi="Calibri"/>
+          <w:color w:val="1E293B"/>
+          <w:sz w:val="19"/>
+        </w:rPr>
+        <w:t xml:space="preserve"> In </w:t>
+      </w:r>
+      <w:r>
+        <w:rPr>
+          <w:rFonts w:ascii="Calibri" w:hAnsi="Calibri"/>
+          <w:i/>
+          <w:color w:val="1E293B"/>
+          <w:sz w:val="19"/>
+        </w:rPr>
+        <w:t>Isayeva, Yusupova and Bazayeva</w:t>
+      </w:r>
+      <w:r>
+        <w:rPr>
+          <w:rFonts w:ascii="Calibri" w:hAnsi="Calibri"/>
+          <w:color w:val="1E293B"/>
+          <w:sz w:val="19"/>
+        </w:rPr>
+        <w:t>, the Respondent State attempted to explain away the destruction of a refugee convoy by arguing that the pilots only targeted two combatant vehicles, and that civilian vehicles emerged into the blast zone after launch or were used as human shields (§ 30). The Court rejected this claim as factually impossible and legally "insurmountable" (§ 192), noting that the pilots flew multiple passes in broad daylight over several hours and could not have failed to perceive the dense civilian traffic (§ 194). In Minab, this precedent legally defeats any assertion that the presence of 156 children and educators was an "unforeseen collateral contingency" or that students entered the blast zone dynamically. The Shajareh Tayyebeh school was an immutable, ten-year-old municipal landmark whose presence was permanently visible.</w:t>
+      </w:r>
+    </w:p>
+    <w:p>
+      <w:pPr>
+        <w:pStyle w:val="ListBullet"/>
+        <w:spacing w:before="20" w:after="40"/>
+      </w:pPr>
+      <w:r>
+        <w:rPr>
+          <w:rFonts w:ascii="Calibri" w:hAnsi="Calibri"/>
+          <w:b/>
+          <w:color w:val="1E293B"/>
+          <w:sz w:val="19"/>
+        </w:rPr>
+        <w:t>(2) Title: Chapter VII, Section 7.2 — The "Planning and Control" Precautionary Standard &amp; Institutional Siloing ([¶ 81 ter](#chapter-7-2)):</w:t>
+      </w:r>
+      <w:r>
+        <w:rPr>
+          <w:rFonts w:ascii="Calibri" w:hAnsi="Calibri"/>
+          <w:color w:val="1E293B"/>
+          <w:sz w:val="19"/>
+        </w:rPr>
+        <w:t xml:space="preserve"> In §§ 171, 187, and 199 of the judgment, the ECtHR established that the duty of care in armed operations is not measured solely at the point of release, but governs the entire administrative and operational architecture of the strike. The Court found a flagrant breach of the positive obligation to protect life because the military authorities who declared a safe corridor and the checkpoint officers who ordered civilians back onto the road never communicated with the air force planners who scheduled combat sorties (§§ 185–187). This institutional blindness directly mirrors the targeting pathology in Minab: while secondary intelligence records noted the conversion of the school in 2016, CENTCOM’s operational kill chain was isolated in obsolete databases, accelerated by automated Maven-Claude algorithms, and stripped of independent civilian harm mitigation oversight (slashing the CHMR unit from 10 analysts to one).</w:t>
+      </w:r>
+    </w:p>
+    <w:p>
+      <w:pPr>
+        <w:pStyle w:val="ListBullet"/>
+        <w:spacing w:before="20" w:after="40"/>
+      </w:pPr>
+      <w:r>
+        <w:rPr>
+          <w:rFonts w:ascii="Calibri" w:hAnsi="Calibri"/>
+          <w:b/>
+          <w:color w:val="1E293B"/>
+          <w:sz w:val="19"/>
+        </w:rPr>
+        <w:t>(3) Title: Chapter VII, Section 7.3 — Weapons Disproportionality &amp; Inappropriate Munitions Blast Envelopes ([¶¶ 83–83 bis](#chapter-7-3)):</w:t>
+      </w:r>
+      <w:r>
+        <w:rPr>
+          <w:rFonts w:ascii="Calibri" w:hAnsi="Calibri"/>
+          <w:color w:val="1E293B"/>
+          <w:sz w:val="19"/>
+        </w:rPr>
+        <w:t xml:space="preserve"> In </w:t>
+      </w:r>
+      <w:r>
+        <w:rPr>
+          <w:rFonts w:ascii="Calibri" w:hAnsi="Calibri"/>
+          <w:i/>
+          <w:color w:val="1E293B"/>
+          <w:sz w:val="19"/>
+        </w:rPr>
+        <w:t>Isayeva, Yusupova and Bazayeva</w:t>
+      </w:r>
+      <w:r>
+        <w:rPr>
+          <w:rFonts w:ascii="Calibri" w:hAnsi="Calibri"/>
+          <w:color w:val="1E293B"/>
+          <w:sz w:val="19"/>
+        </w:rPr>
+        <w:t xml:space="preserve">, the Court held that deploying twelve heavy unguided S-24 missiles (each carrying 123 kg of high explosives, creating over 4,000 fragments across a lethal dispersal radius of 300 to 800 metres) against targets located among or adjacent to civilians was disproportionate </w:t>
+      </w:r>
+      <w:r>
+        <w:rPr>
+          <w:rFonts w:ascii="Calibri" w:hAnsi="Calibri"/>
+          <w:i/>
+          <w:color w:val="1E293B"/>
+          <w:sz w:val="19"/>
+        </w:rPr>
+        <w:t>per se</w:t>
+      </w:r>
+      <w:r>
+        <w:rPr>
+          <w:rFonts w:ascii="Calibri" w:hAnsi="Calibri"/>
+          <w:color w:val="1E293B"/>
+          <w:sz w:val="19"/>
+        </w:rPr>
+        <w:t xml:space="preserve"> (§§ 195, 199). Fused with the companion ruling in </w:t>
+      </w:r>
+      <w:r>
+        <w:rPr>
+          <w:rFonts w:ascii="Calibri" w:hAnsi="Calibri"/>
+          <w:i/>
+          <w:color w:val="1E293B"/>
+          <w:sz w:val="19"/>
+        </w:rPr>
+        <w:t>Isayeva v. Russia</w:t>
+      </w:r>
+      <w:r>
+        <w:rPr>
+          <w:rFonts w:ascii="Calibri" w:hAnsi="Calibri"/>
+          <w:color w:val="1E293B"/>
+          <w:sz w:val="19"/>
+        </w:rPr>
+        <w:t xml:space="preserve"> (Katyr-Yurt, §§ 189–191) concerning FAB-250 and FAB-500 bombs, the unified </w:t>
+      </w:r>
+      <w:r>
+        <w:rPr>
+          <w:rFonts w:ascii="Calibri" w:hAnsi="Calibri"/>
+          <w:i/>
+          <w:color w:val="1E293B"/>
+          <w:sz w:val="19"/>
+        </w:rPr>
+        <w:t>Isayeva</w:t>
+      </w:r>
+      <w:r>
+        <w:rPr>
+          <w:rFonts w:ascii="Calibri" w:hAnsi="Calibri"/>
+          <w:color w:val="1E293B"/>
+          <w:sz w:val="19"/>
+        </w:rPr>
+        <w:t xml:space="preserve"> doctrine establishes that deploying heavy blast-fragmentation munitions within the lethal radius of a civilian concentration violates the right to life as a matter of law. In Minab, detonating three 1,000-lb WDU-36/B unitary warheads (each containing 195 kg of PBXN-109 high explosive with a 300-metre casualty envelope) exactly 42 metres from an active elementary school made the mass death of 156 civilians mathematically inevitable, far exceeding any conceivable military advantage under AP I Article 51(5)(b).</w:t>
+      </w:r>
+    </w:p>
+    <w:p>
+      <w:pPr>
+        <w:pStyle w:val="ListBullet"/>
+        <w:spacing w:before="20" w:after="40"/>
+      </w:pPr>
+      <w:r>
+        <w:rPr>
+          <w:rFonts w:ascii="Calibri" w:hAnsi="Calibri"/>
+          <w:b/>
+          <w:color w:val="1E293B"/>
+          <w:sz w:val="19"/>
+        </w:rPr>
+        <w:t>(4) Title: Chapter VIII, Section 8.1 — Upstream Concentration of Culpability &amp; Exoneration of Tactical Operators ([¶ 88 bis](#chapter-8-1)):</w:t>
+      </w:r>
+      <w:r>
+        <w:rPr>
+          <w:rFonts w:ascii="Calibri" w:hAnsi="Calibri"/>
+          <w:color w:val="1E293B"/>
+          <w:sz w:val="19"/>
+        </w:rPr>
+        <w:t xml:space="preserve"> In </w:t>
+      </w:r>
+      <w:r>
+        <w:rPr>
+          <w:rFonts w:ascii="Calibri" w:hAnsi="Calibri"/>
+          <w:i/>
+          <w:color w:val="1E293B"/>
+          <w:sz w:val="19"/>
+        </w:rPr>
+        <w:t>Isayeva, Yusupova and Bazayeva</w:t>
+      </w:r>
+      <w:r>
+        <w:rPr>
+          <w:rFonts w:ascii="Calibri" w:hAnsi="Calibri"/>
+          <w:color w:val="1E293B"/>
+          <w:sz w:val="19"/>
+        </w:rPr>
+        <w:t xml:space="preserve">, the domestic Russian military prosecution terminated criminal proceedings against the individual pilots ("Ivanov" and "Petrov") on the basis that they had simply carried out assigned flight orders and responded to ground direction (§§ 38–40). The ECtHR did not overturn this finding to demand the conviction of the tactical aircrew; rather, it held that legal responsibility attached to the commanding authorities who planned and directed the mission without verifying the target (§§ 171, 199–200). This provides authoritative European human rights endorsement for the ICTY NATO Report § 85 principle: the tactical naval launch crews aboard the USS </w:t>
+      </w:r>
+      <w:r>
+        <w:rPr>
+          <w:rFonts w:ascii="Calibri" w:hAnsi="Calibri"/>
+          <w:i/>
+          <w:color w:val="1E293B"/>
+          <w:sz w:val="19"/>
+        </w:rPr>
+        <w:t>Abraham Lincoln</w:t>
+      </w:r>
+      <w:r>
+        <w:rPr>
+          <w:rFonts w:ascii="Calibri" w:hAnsi="Calibri"/>
+          <w:color w:val="1E293B"/>
+          <w:sz w:val="19"/>
+        </w:rPr>
+        <w:t xml:space="preserve"> bear zero legal culpability, while 100% of the institutional, criminal, and state culpability concentrates upstream upon the intelligence nominators, database managers, and targeting review boards.</w:t>
+      </w:r>
+    </w:p>
+    <w:p>
+      <w:pPr>
+        <w:pStyle w:val="ListBullet"/>
+        <w:spacing w:before="20" w:after="40"/>
+      </w:pPr>
+      <w:r>
+        <w:rPr>
+          <w:rFonts w:ascii="Calibri" w:hAnsi="Calibri"/>
+          <w:b/>
+          <w:color w:val="1E293B"/>
+          <w:sz w:val="19"/>
+        </w:rPr>
+        <w:t>(5) Title: Chapter IX, Section 9.3 — Autonomous European Detachable Procedural Duty to Investigate ([¶ 94 bis](#chapter-9-3)):</w:t>
+      </w:r>
+      <w:r>
+        <w:rPr>
+          <w:rFonts w:ascii="Calibri" w:hAnsi="Calibri"/>
+          <w:color w:val="1E293B"/>
+          <w:sz w:val="19"/>
+        </w:rPr>
+        <w:t xml:space="preserve"> In §§ 208–225 of the judgment, the ECtHR articulated the canonical criteria governing the procedural obligation under Article 2 to investigate lethal military strikes. The Court condemned the domestic investigation because: (i) it was delayed for months despite public Red Cross notifications (§§ 215–218); (ii) it failed to secure mission flight logs, operations record books, or orders from senior commanders (§§ 220–222); (iii) it closed proceedings based on identical, self-serving military witness statements without independent verification (§§ 39–40, 179); and (iv) it excluded the victims and their families from meaningful participation (§ 224). CENTCOM’s internal AR 15-6 review into Minab replicates every defect condemned in </w:t>
+      </w:r>
+      <w:r>
+        <w:rPr>
+          <w:rFonts w:ascii="Calibri" w:hAnsi="Calibri"/>
+          <w:i/>
+          <w:color w:val="1E293B"/>
+          <w:sz w:val="19"/>
+        </w:rPr>
+        <w:t>Isayeva</w:t>
+      </w:r>
+      <w:r>
+        <w:rPr>
+          <w:rFonts w:ascii="Calibri" w:hAnsi="Calibri"/>
+          <w:color w:val="1E293B"/>
+          <w:sz w:val="19"/>
+        </w:rPr>
+        <w:t>, thereby failing to satisfy international standards and triggering the subsidiary procedural jurisdiction of European universal jurisdiction authorities in Finland (</w:t>
+      </w:r>
+      <w:r>
+        <w:rPr>
+          <w:rFonts w:ascii="Calibri" w:hAnsi="Calibri"/>
+          <w:i/>
+          <w:color w:val="1E293B"/>
+          <w:sz w:val="19"/>
+        </w:rPr>
+        <w:t>Rikoslaki</w:t>
+      </w:r>
+      <w:r>
+        <w:rPr>
+          <w:rFonts w:ascii="Calibri" w:hAnsi="Calibri"/>
+          <w:color w:val="1E293B"/>
+          <w:sz w:val="19"/>
+        </w:rPr>
+        <w:t xml:space="preserve"> Ch. 11) and Germany (</w:t>
+      </w:r>
+      <w:r>
+        <w:rPr>
+          <w:rFonts w:ascii="Calibri" w:hAnsi="Calibri"/>
+          <w:i/>
+          <w:color w:val="1E293B"/>
+          <w:sz w:val="19"/>
+        </w:rPr>
+        <w:t>VStGB</w:t>
+      </w:r>
+      <w:r>
+        <w:rPr>
+          <w:rFonts w:ascii="Calibri" w:hAnsi="Calibri"/>
+          <w:color w:val="1E293B"/>
+          <w:sz w:val="19"/>
+        </w:rPr>
+        <w:t xml:space="preserve"> § 1).</w:t>
       </w:r>
     </w:p>
     <w:p>

</xml_diff>